<commit_message>
Update the module-list doc with the 5 modules added since it was written
Sample CV Library, Learning Resources Library, Corporate Culture & Work
Environment, Business Etiquette & Professional Conduct, and AI Assistant
were all added to the app after this document was last touched (it still
said "Total modules: 25"). Inserted each into its closest-fitting phase,
added AI Assistant as a standalone note since it's not phase-sequenced
(always available, not tab-opened), and updated the count to 30.

Skill Equivalency Matrix is now highlighted, per request — it's the
module this session brought back after an earlier removal.

Co-Authored-By: Claude Sonnet 5 <noreply@anthropic.com>
</commit_message>
<xml_diff>
--- a/docs/Next_Career_After_Fauj_Modules.docx
+++ b/docs/Next_Career_After_Fauj_Modules.docx
@@ -130,6 +130,11 @@
         <w:t xml:space="preserve">5. </w:t>
       </w:r>
       <w:r>
+        <w:rPr>
+          <w:b/>
+          <w:bCs/>
+          <w:highlight w:val="yellow"/>
+        </w:rPr>
         <w:t xml:space="preserve">Skill Equivalency Matrix</w:t>
       </w:r>
     </w:p>
@@ -270,6 +275,22 @@
         <w:t xml:space="preserve">13. </w:t>
       </w:r>
       <w:r>
+        <w:t xml:space="preserve">Sample CV Library</w:t>
+      </w:r>
+    </w:p>
+    <w:p>
+      <w:pPr>
+        <w:spacing w:after="140"/>
+        <w:ind w:left="360"/>
+      </w:pPr>
+      <w:r>
+        <w:rPr>
+          <w:b/>
+          <w:bCs/>
+        </w:rPr>
+        <w:t xml:space="preserve">14. </w:t>
+      </w:r>
+      <w:r>
         <w:t xml:space="preserve">JD Match</w:t>
       </w:r>
     </w:p>
@@ -283,7 +304,7 @@
           <w:b/>
           <w:bCs/>
         </w:rPr>
-        <w:t xml:space="preserve">14. </w:t>
+        <w:t xml:space="preserve">15. </w:t>
       </w:r>
       <w:r>
         <w:t xml:space="preserve">Refined CV</w:t>
@@ -299,7 +320,7 @@
           <w:b/>
           <w:bCs/>
         </w:rPr>
-        <w:t xml:space="preserve">15. </w:t>
+        <w:t xml:space="preserve">16. </w:t>
       </w:r>
       <w:r>
         <w:t xml:space="preserve">Gap Roadmap</w:t>
@@ -315,7 +336,7 @@
           <w:b/>
           <w:bCs/>
         </w:rPr>
-        <w:t xml:space="preserve">16. </w:t>
+        <w:t xml:space="preserve">17. </w:t>
       </w:r>
       <w:r>
         <w:t xml:space="preserve">Corporate Language Guide</w:t>
@@ -331,10 +352,26 @@
           <w:b/>
           <w:bCs/>
         </w:rPr>
-        <w:t xml:space="preserve">17. </w:t>
+        <w:t xml:space="preserve">18. </w:t>
       </w:r>
       <w:r>
         <w:t xml:space="preserve">Corporate Transition - Reading Programme</w:t>
+      </w:r>
+    </w:p>
+    <w:p>
+      <w:pPr>
+        <w:spacing w:after="140"/>
+        <w:ind w:left="360"/>
+      </w:pPr>
+      <w:r>
+        <w:rPr>
+          <w:b/>
+          <w:bCs/>
+        </w:rPr>
+        <w:t xml:space="preserve">19. </w:t>
+      </w:r>
+      <w:r>
+        <w:t xml:space="preserve">Learning Resources Library</w:t>
       </w:r>
     </w:p>
     <w:p>
@@ -359,7 +396,7 @@
           <w:b/>
           <w:bCs/>
         </w:rPr>
-        <w:t xml:space="preserve">18. </w:t>
+        <w:t xml:space="preserve">20. </w:t>
       </w:r>
       <w:r>
         <w:t xml:space="preserve">Job Matches</w:t>
@@ -375,7 +412,7 @@
           <w:b/>
           <w:bCs/>
         </w:rPr>
-        <w:t xml:space="preserve">19. </w:t>
+        <w:t xml:space="preserve">21. </w:t>
       </w:r>
       <w:r>
         <w:t xml:space="preserve">Application Tracker</w:t>
@@ -391,7 +428,7 @@
           <w:b/>
           <w:bCs/>
         </w:rPr>
-        <w:t xml:space="preserve">20. </w:t>
+        <w:t xml:space="preserve">22. </w:t>
       </w:r>
       <w:r>
         <w:t xml:space="preserve">Future Mentor Sign Up</w:t>
@@ -407,7 +444,7 @@
           <w:b/>
           <w:bCs/>
         </w:rPr>
-        <w:t xml:space="preserve">21. </w:t>
+        <w:t xml:space="preserve">23. </w:t>
       </w:r>
       <w:r>
         <w:t xml:space="preserve">LinkedIn Write-up</w:t>
@@ -435,7 +472,7 @@
           <w:b/>
           <w:bCs/>
         </w:rPr>
-        <w:t xml:space="preserve">22. </w:t>
+        <w:t xml:space="preserve">24. </w:t>
       </w:r>
       <w:r>
         <w:t xml:space="preserve">Interview Prep</w:t>
@@ -451,7 +488,39 @@
           <w:b/>
           <w:bCs/>
         </w:rPr>
-        <w:t xml:space="preserve">23. </w:t>
+        <w:t xml:space="preserve">25. </w:t>
+      </w:r>
+      <w:r>
+        <w:t xml:space="preserve">Corporate Culture &amp; Work Environment</w:t>
+      </w:r>
+    </w:p>
+    <w:p>
+      <w:pPr>
+        <w:spacing w:after="140"/>
+        <w:ind w:left="360"/>
+      </w:pPr>
+      <w:r>
+        <w:rPr>
+          <w:b/>
+          <w:bCs/>
+        </w:rPr>
+        <w:t xml:space="preserve">26. </w:t>
+      </w:r>
+      <w:r>
+        <w:t xml:space="preserve">Business Etiquette &amp; Professional Conduct</w:t>
+      </w:r>
+    </w:p>
+    <w:p>
+      <w:pPr>
+        <w:spacing w:after="140"/>
+        <w:ind w:left="360"/>
+      </w:pPr>
+      <w:r>
+        <w:rPr>
+          <w:b/>
+          <w:bCs/>
+        </w:rPr>
+        <w:t xml:space="preserve">27. </w:t>
       </w:r>
       <w:r>
         <w:t xml:space="preserve">Compensation Guidance</w:t>
@@ -467,7 +536,7 @@
           <w:b/>
           <w:bCs/>
         </w:rPr>
-        <w:t xml:space="preserve">24. </w:t>
+        <w:t xml:space="preserve">28. </w:t>
       </w:r>
       <w:r>
         <w:t xml:space="preserve">Financial &amp; Cost-of-Living Calculator</w:t>
@@ -483,7 +552,7 @@
           <w:b/>
           <w:bCs/>
         </w:rPr>
-        <w:t xml:space="preserve">25. </w:t>
+        <w:t xml:space="preserve">29. </w:t>
       </w:r>
       <w:r>
         <w:t xml:space="preserve">Your First 90 Days</w:t>
@@ -491,6 +560,19 @@
     </w:p>
     <w:p>
       <w:pPr>
+        <w:spacing w:after="140" w:before="200"/>
+      </w:pPr>
+      <w:r>
+        <w:rPr>
+          <w:i/>
+          <w:iCs/>
+          <w:color w:val="555555"/>
+        </w:rPr>
+        <w:t xml:space="preserve">Also available on every screen, not part of the phase sequence above: AI Assistant — a floating assistant button, always reachable.</w:t>
+      </w:r>
+    </w:p>
+    <w:p>
+      <w:pPr>
         <w:spacing w:before="300"/>
       </w:pPr>
       <w:r>
@@ -499,7 +581,7 @@
           <w:bCs/>
           <w:color w:val="555555"/>
         </w:rPr>
-        <w:t xml:space="preserve">Total modules: 25</w:t>
+        <w:t xml:space="preserve">Total modules: 30</w:t>
       </w:r>
     </w:p>
     <w:sectPr>

</xml_diff>

<commit_message>
Move Skill Equivalency Matrix to its actual current position in the list
Was still sitting in "Phase 1 — Orientation" next to Corps/Arm/Branch Fit
Matrix (a Career-tab module) — a leftover from the original planning
taxonomy, not where it lives today. Moved to right after Corporate
Language Guide, matching its real position in the Learn tab's Build Your
CV group (module_catalog.dart). Same correction applied to the live
Google Form's checkbox order in this session. Highlight preserved.

Co-Authored-By: Claude Sonnet 5 <noreply@anthropic.com>
</commit_message>
<xml_diff>
--- a/docs/Next_Career_After_Fauj_Modules.docx
+++ b/docs/Next_Career_After_Fauj_Modules.docx
@@ -119,27 +119,6 @@
     </w:p>
     <w:p>
       <w:pPr>
-        <w:spacing w:after="140"/>
-        <w:ind w:left="360"/>
-      </w:pPr>
-      <w:r>
-        <w:rPr>
-          <w:b/>
-          <w:bCs/>
-        </w:rPr>
-        <w:t xml:space="preserve">5. </w:t>
-      </w:r>
-      <w:r>
-        <w:rPr>
-          <w:b/>
-          <w:bCs/>
-          <w:highlight w:val="yellow"/>
-        </w:rPr>
-        <w:t xml:space="preserve">Skill Equivalency Matrix</w:t>
-      </w:r>
-    </w:p>
-    <w:p>
-      <w:pPr>
         <w:pStyle w:val="Heading2"/>
         <w:spacing w:after="120" w:before="300"/>
       </w:pPr>
@@ -160,10 +139,26 @@
           <w:b/>
           <w:bCs/>
         </w:rPr>
+        <w:t xml:space="preserve">5. </w:t>
+      </w:r>
+      <w:r>
+        <w:t xml:space="preserve">Transition Readiness Index</w:t>
+      </w:r>
+    </w:p>
+    <w:p>
+      <w:pPr>
+        <w:spacing w:after="140"/>
+        <w:ind w:left="360"/>
+      </w:pPr>
+      <w:r>
+        <w:rPr>
+          <w:b/>
+          <w:bCs/>
+        </w:rPr>
         <w:t xml:space="preserve">6. </w:t>
       </w:r>
       <w:r>
-        <w:t xml:space="preserve">Transition Readiness Index</w:t>
+        <w:t xml:space="preserve">AI Readiness</w:t>
       </w:r>
     </w:p>
     <w:p>
@@ -179,7 +174,7 @@
         <w:t xml:space="preserve">7. </w:t>
       </w:r>
       <w:r>
-        <w:t xml:space="preserve">AI Readiness</w:t>
+        <w:t xml:space="preserve">Career Vertical Fit</w:t>
       </w:r>
     </w:p>
     <w:p>
@@ -195,7 +190,7 @@
         <w:t xml:space="preserve">8. </w:t>
       </w:r>
       <w:r>
-        <w:t xml:space="preserve">Career Vertical Fit</w:t>
+        <w:t xml:space="preserve">Target Role Strategy</w:t>
       </w:r>
     </w:p>
     <w:p>
@@ -211,7 +206,7 @@
         <w:t xml:space="preserve">9. </w:t>
       </w:r>
       <w:r>
-        <w:t xml:space="preserve">Target Role Strategy</w:t>
+        <w:t xml:space="preserve">Base CV, Civilianized</w:t>
       </w:r>
     </w:p>
     <w:p>
@@ -227,7 +222,7 @@
         <w:t xml:space="preserve">10. </w:t>
       </w:r>
       <w:r>
-        <w:t xml:space="preserve">Base CV, Civilianized</w:t>
+        <w:t xml:space="preserve">Build My Civilian CV</w:t>
       </w:r>
     </w:p>
     <w:p>
@@ -243,7 +238,7 @@
         <w:t xml:space="preserve">11. </w:t>
       </w:r>
       <w:r>
-        <w:t xml:space="preserve">Build My Civilian CV</w:t>
+        <w:t xml:space="preserve">CV Writing Guide &amp; Templates</w:t>
       </w:r>
     </w:p>
     <w:p>
@@ -259,7 +254,7 @@
         <w:t xml:space="preserve">12. </w:t>
       </w:r>
       <w:r>
-        <w:t xml:space="preserve">CV Writing Guide &amp; Templates</w:t>
+        <w:t xml:space="preserve">Sample CV Library</w:t>
       </w:r>
     </w:p>
     <w:p>
@@ -275,7 +270,7 @@
         <w:t xml:space="preserve">13. </w:t>
       </w:r>
       <w:r>
-        <w:t xml:space="preserve">Sample CV Library</w:t>
+        <w:t xml:space="preserve">JD Match</w:t>
       </w:r>
     </w:p>
     <w:p>
@@ -291,7 +286,7 @@
         <w:t xml:space="preserve">14. </w:t>
       </w:r>
       <w:r>
-        <w:t xml:space="preserve">JD Match</w:t>
+        <w:t xml:space="preserve">Refined CV</w:t>
       </w:r>
     </w:p>
     <w:p>
@@ -307,7 +302,7 @@
         <w:t xml:space="preserve">15. </w:t>
       </w:r>
       <w:r>
-        <w:t xml:space="preserve">Refined CV</w:t>
+        <w:t xml:space="preserve">Gap Roadmap</w:t>
       </w:r>
     </w:p>
     <w:p>
@@ -323,7 +318,7 @@
         <w:t xml:space="preserve">16. </w:t>
       </w:r>
       <w:r>
-        <w:t xml:space="preserve">Gap Roadmap</w:t>
+        <w:t xml:space="preserve">Corporate Language Guide</w:t>
       </w:r>
     </w:p>
     <w:p>
@@ -339,7 +334,12 @@
         <w:t xml:space="preserve">17. </w:t>
       </w:r>
       <w:r>
-        <w:t xml:space="preserve">Corporate Language Guide</w:t>
+        <w:rPr>
+          <w:b/>
+          <w:bCs/>
+          <w:highlight w:val="yellow"/>
+        </w:rPr>
+        <w:t xml:space="preserve">Skill Equivalency Matrix</w:t>
       </w:r>
     </w:p>
     <w:p>

</xml_diff>